<commit_message>
Changes working on week 10 homework
</commit_message>
<xml_diff>
--- a/modules/wk_10_image_analysis/KatherineMarkstein_ImageAnalysis_HW_Part1.docx
+++ b/modules/wk_10_image_analysis/KatherineMarkstein_ImageAnalysis_HW_Part1.docx
@@ -293,15 +293,30 @@
           <w:szCs w:val="22"/>
         </w:rPr>
       </w:pPr>
-    </w:p>
-    <w:p>
-      <w:pPr>
-        <w:rPr>
-          <w:rFonts w:ascii="Arial" w:hAnsi="Arial" w:cs="Arial"/>
-          <w:sz w:val="22"/>
-          <w:szCs w:val="22"/>
-        </w:rPr>
-      </w:pPr>
+      <w:r>
+        <w:rPr>
+          <w:noProof/>
+        </w:rPr>
+        <w:drawing>
+          <wp:inline distT="0" distB="0" distL="0" distR="0" wp14:anchorId="57699E93" wp14:editId="6F02D51B">
+            <wp:extent cx="4572000" cy="2743200"/>
+            <wp:effectExtent l="0" t="0" r="0" b="0"/>
+            <wp:docPr id="1666272074" name="Chart 1">
+              <a:extLst xmlns:a="http://schemas.openxmlformats.org/drawingml/2006/main">
+                <a:ext uri="{FF2B5EF4-FFF2-40B4-BE49-F238E27FC236}">
+                  <a16:creationId xmlns:a16="http://schemas.microsoft.com/office/drawing/2014/main" id="{85F1FDA1-5500-28B2-5E17-0802B631BDF3}"/>
+                </a:ext>
+              </a:extLst>
+            </wp:docPr>
+            <wp:cNvGraphicFramePr/>
+            <a:graphic xmlns:a="http://schemas.openxmlformats.org/drawingml/2006/main">
+              <a:graphicData uri="http://schemas.openxmlformats.org/drawingml/2006/chart">
+                <c:chart xmlns:c="http://schemas.openxmlformats.org/drawingml/2006/chart" xmlns:r="http://schemas.openxmlformats.org/officeDocument/2006/relationships" r:id="rId5"/>
+              </a:graphicData>
+            </a:graphic>
+          </wp:inline>
+        </w:drawing>
+      </w:r>
     </w:p>
     <w:p>
       <w:pPr>
@@ -459,13 +474,37 @@
     </w:p>
     <w:p>
       <w:pPr>
-        <w:pStyle w:val="ListParagraph"/>
         <w:rPr>
           <w:rFonts w:ascii="Arial" w:hAnsi="Arial" w:cs="Arial"/>
           <w:sz w:val="22"/>
           <w:szCs w:val="22"/>
         </w:rPr>
       </w:pPr>
+      <w:r>
+        <w:rPr>
+          <w:noProof/>
+        </w:rPr>
+        <w:lastRenderedPageBreak/>
+        <w:drawing>
+          <wp:inline distT="0" distB="0" distL="0" distR="0" wp14:anchorId="6CEF6B7B" wp14:editId="37FB4A71">
+            <wp:extent cx="4572000" cy="2743200"/>
+            <wp:effectExtent l="0" t="0" r="0" b="0"/>
+            <wp:docPr id="1662881587" name="Chart 1">
+              <a:extLst xmlns:a="http://schemas.openxmlformats.org/drawingml/2006/main">
+                <a:ext uri="{FF2B5EF4-FFF2-40B4-BE49-F238E27FC236}">
+                  <a16:creationId xmlns:a16="http://schemas.microsoft.com/office/drawing/2014/main" id="{7C64A6C2-7DAE-B109-5949-D0F00141A450}"/>
+                </a:ext>
+              </a:extLst>
+            </wp:docPr>
+            <wp:cNvGraphicFramePr/>
+            <a:graphic xmlns:a="http://schemas.openxmlformats.org/drawingml/2006/main">
+              <a:graphicData uri="http://schemas.openxmlformats.org/drawingml/2006/chart">
+                <c:chart xmlns:c="http://schemas.openxmlformats.org/drawingml/2006/chart" xmlns:r="http://schemas.openxmlformats.org/officeDocument/2006/relationships" r:id="rId6"/>
+              </a:graphicData>
+            </a:graphic>
+          </wp:inline>
+        </w:drawing>
+      </w:r>
     </w:p>
     <w:p>
       <w:pPr>
@@ -656,6 +695,160 @@
       </w:r>
     </w:p>
     <w:p/>
+    <w:p/>
+    <w:p>
+      <w:proofErr w:type="gramStart"/>
+      <w:r>
+        <w:t>run(</w:t>
+      </w:r>
+      <w:proofErr w:type="gramEnd"/>
+      <w:r>
+        <w:t>"Tree Rings"</w:t>
+      </w:r>
+      <w:proofErr w:type="gramStart"/>
+      <w:r>
+        <w:t>);</w:t>
+      </w:r>
+      <w:proofErr w:type="gramEnd"/>
+    </w:p>
+    <w:p>
+      <w:r>
+        <w:t>//</w:t>
+      </w:r>
+      <w:proofErr w:type="gramStart"/>
+      <w:r>
+        <w:t>run(</w:t>
+      </w:r>
+      <w:proofErr w:type="gramEnd"/>
+      <w:r>
+        <w:t>"Brightness/Contrast..."</w:t>
+      </w:r>
+      <w:proofErr w:type="gramStart"/>
+      <w:r>
+        <w:t>);</w:t>
+      </w:r>
+      <w:proofErr w:type="gramEnd"/>
+    </w:p>
+    <w:p>
+      <w:proofErr w:type="gramStart"/>
+      <w:r>
+        <w:t>run(</w:t>
+      </w:r>
+      <w:proofErr w:type="gramEnd"/>
+      <w:r>
+        <w:t>"Apply LUT"</w:t>
+      </w:r>
+      <w:proofErr w:type="gramStart"/>
+      <w:r>
+        <w:t>);</w:t>
+      </w:r>
+      <w:proofErr w:type="gramEnd"/>
+    </w:p>
+    <w:p>
+      <w:r>
+        <w:t>run("Close"</w:t>
+      </w:r>
+      <w:proofErr w:type="gramStart"/>
+      <w:r>
+        <w:t>);</w:t>
+      </w:r>
+      <w:proofErr w:type="gramEnd"/>
+    </w:p>
+    <w:p>
+      <w:proofErr w:type="gramStart"/>
+      <w:r>
+        <w:t>run(</w:t>
+      </w:r>
+      <w:proofErr w:type="gramEnd"/>
+      <w:r>
+        <w:t>"16 colors"</w:t>
+      </w:r>
+      <w:proofErr w:type="gramStart"/>
+      <w:r>
+        <w:t>);</w:t>
+      </w:r>
+      <w:proofErr w:type="gramEnd"/>
+    </w:p>
+    <w:p>
+      <w:proofErr w:type="spellStart"/>
+      <w:proofErr w:type="gramStart"/>
+      <w:r>
+        <w:t>saveAs</w:t>
+      </w:r>
+      <w:proofErr w:type="spellEnd"/>
+      <w:r>
+        <w:t>(</w:t>
+      </w:r>
+      <w:proofErr w:type="gramEnd"/>
+      <w:r>
+        <w:t>"Jpeg", "C:/Users/kmark/Documents/GitHub/CM515-2026/modules/wk_10_image_analysis/Tree_Rings_Modified.jpg"</w:t>
+      </w:r>
+      <w:proofErr w:type="gramStart"/>
+      <w:r>
+        <w:t>);</w:t>
+      </w:r>
+      <w:proofErr w:type="gramEnd"/>
+    </w:p>
+    <w:p>
+      <w:proofErr w:type="gramStart"/>
+      <w:r>
+        <w:t>close;</w:t>
+      </w:r>
+      <w:proofErr w:type="gramEnd"/>
+    </w:p>
+    <w:p>
+      <w:r>
+        <w:lastRenderedPageBreak/>
+        <w:drawing>
+          <wp:inline distT="0" distB="0" distL="0" distR="0" wp14:anchorId="6C497FFD" wp14:editId="67FE0ECD">
+            <wp:extent cx="5943600" cy="537210"/>
+            <wp:effectExtent l="0" t="0" r="0" b="0"/>
+            <wp:docPr id="659943649" name="Picture 2" descr="The image displays a vibrant, swirling pattern of alternating yellow and blue stripes, reminiscent of a kaleidoscope.&#10;&#10;AI-generated content may be incorrect."/>
+            <wp:cNvGraphicFramePr>
+              <a:graphicFrameLocks xmlns:a="http://schemas.openxmlformats.org/drawingml/2006/main" noChangeAspect="1"/>
+            </wp:cNvGraphicFramePr>
+            <a:graphic xmlns:a="http://schemas.openxmlformats.org/drawingml/2006/main">
+              <a:graphicData uri="http://schemas.openxmlformats.org/drawingml/2006/picture">
+                <pic:pic xmlns:pic="http://schemas.openxmlformats.org/drawingml/2006/picture">
+                  <pic:nvPicPr>
+                    <pic:cNvPr id="659943649" name="Picture 2" descr="The image displays a vibrant, swirling pattern of alternating yellow and blue stripes, reminiscent of a kaleidoscope.&#10;&#10;AI-generated content may be incorrect."/>
+                    <pic:cNvPicPr>
+                      <a:picLocks noChangeAspect="1" noChangeArrowheads="1"/>
+                    </pic:cNvPicPr>
+                  </pic:nvPicPr>
+                  <pic:blipFill>
+                    <a:blip r:embed="rId7" cstate="print">
+                      <a:extLst>
+                        <a:ext uri="{28A0092B-C50C-407E-A947-70E740481C1C}">
+                          <a14:useLocalDpi xmlns:a14="http://schemas.microsoft.com/office/drawing/2010/main" val="0"/>
+                        </a:ext>
+                      </a:extLst>
+                    </a:blip>
+                    <a:srcRect/>
+                    <a:stretch>
+                      <a:fillRect/>
+                    </a:stretch>
+                  </pic:blipFill>
+                  <pic:spPr bwMode="auto">
+                    <a:xfrm>
+                      <a:off x="0" y="0"/>
+                      <a:ext cx="5943600" cy="537210"/>
+                    </a:xfrm>
+                    <a:prstGeom prst="rect">
+                      <a:avLst/>
+                    </a:prstGeom>
+                    <a:noFill/>
+                    <a:ln>
+                      <a:noFill/>
+                    </a:ln>
+                  </pic:spPr>
+                </pic:pic>
+              </a:graphicData>
+            </a:graphic>
+          </wp:inline>
+        </w:drawing>
+      </w:r>
+    </w:p>
     <w:p/>
     <w:p>
       <w:pPr>
@@ -1404,7 +1597,6 @@
   <w:style w:type="character" w:default="1" w:styleId="DefaultParagraphFont">
     <w:name w:val="Default Paragraph Font"/>
     <w:uiPriority w:val="1"/>
-    <w:semiHidden/>
     <w:unhideWhenUsed/>
   </w:style>
   <w:style w:type="table" w:default="1" w:styleId="TableNormal">
@@ -1789,6 +1981,1992 @@
 </w:styles>
 </file>
 
+<file path=word/charts/chart1.xml><?xml version="1.0" encoding="utf-8"?>
+<c:chartSpace xmlns:c="http://schemas.openxmlformats.org/drawingml/2006/chart" xmlns:a="http://schemas.openxmlformats.org/drawingml/2006/main" xmlns:r="http://schemas.openxmlformats.org/officeDocument/2006/relationships" xmlns:c16r2="http://schemas.microsoft.com/office/drawing/2015/06/chart">
+  <c:date1904 val="0"/>
+  <c:lang val="en-US"/>
+  <c:roundedCorners val="0"/>
+  <mc:AlternateContent xmlns:mc="http://schemas.openxmlformats.org/markup-compatibility/2006">
+    <mc:Choice xmlns:c14="http://schemas.microsoft.com/office/drawing/2007/8/2/chart" Requires="c14">
+      <c14:style val="102"/>
+    </mc:Choice>
+    <mc:Fallback>
+      <c:style val="2"/>
+    </mc:Fallback>
+  </mc:AlternateContent>
+  <c:chart>
+    <c:title>
+      <c:tx>
+        <c:rich>
+          <a:bodyPr rot="0" spcFirstLastPara="1" vertOverflow="ellipsis" vert="horz" wrap="square" anchor="ctr" anchorCtr="1"/>
+          <a:lstStyle/>
+          <a:p>
+            <a:pPr>
+              <a:defRPr sz="1400" b="0" i="0" u="none" strike="noStrike" kern="1200" spc="0" baseline="0">
+                <a:solidFill>
+                  <a:schemeClr val="tx1">
+                    <a:lumMod val="65000"/>
+                    <a:lumOff val="35000"/>
+                  </a:schemeClr>
+                </a:solidFill>
+                <a:latin typeface="+mn-lt"/>
+                <a:ea typeface="+mn-ea"/>
+                <a:cs typeface="+mn-cs"/>
+              </a:defRPr>
+            </a:pPr>
+            <a:r>
+              <a:rPr lang="en-US"/>
+              <a:t>Western Blot</a:t>
+            </a:r>
+            <a:r>
+              <a:rPr lang="en-US" baseline="0"/>
+              <a:t> 1 (Not Normalized)</a:t>
+            </a:r>
+            <a:endParaRPr lang="en-US"/>
+          </a:p>
+        </c:rich>
+      </c:tx>
+      <c:overlay val="0"/>
+      <c:spPr>
+        <a:noFill/>
+        <a:ln>
+          <a:noFill/>
+        </a:ln>
+        <a:effectLst/>
+      </c:spPr>
+      <c:txPr>
+        <a:bodyPr rot="0" spcFirstLastPara="1" vertOverflow="ellipsis" vert="horz" wrap="square" anchor="ctr" anchorCtr="1"/>
+        <a:lstStyle/>
+        <a:p>
+          <a:pPr>
+            <a:defRPr sz="1400" b="0" i="0" u="none" strike="noStrike" kern="1200" spc="0" baseline="0">
+              <a:solidFill>
+                <a:schemeClr val="tx1">
+                  <a:lumMod val="65000"/>
+                  <a:lumOff val="35000"/>
+                </a:schemeClr>
+              </a:solidFill>
+              <a:latin typeface="+mn-lt"/>
+              <a:ea typeface="+mn-ea"/>
+              <a:cs typeface="+mn-cs"/>
+            </a:defRPr>
+          </a:pPr>
+          <a:endParaRPr lang="en-US"/>
+        </a:p>
+      </c:txPr>
+    </c:title>
+    <c:autoTitleDeleted val="0"/>
+    <c:plotArea>
+      <c:layout/>
+      <c:barChart>
+        <c:barDir val="col"/>
+        <c:grouping val="clustered"/>
+        <c:varyColors val="0"/>
+        <c:ser>
+          <c:idx val="0"/>
+          <c:order val="0"/>
+          <c:tx>
+            <c:strRef>
+              <c:f>Sheet1!$B$1</c:f>
+              <c:strCache>
+                <c:ptCount val="1"/>
+                <c:pt idx="0">
+                  <c:v>Area Under Curve</c:v>
+                </c:pt>
+              </c:strCache>
+            </c:strRef>
+          </c:tx>
+          <c:spPr>
+            <a:solidFill>
+              <a:schemeClr val="accent1"/>
+            </a:solidFill>
+            <a:ln>
+              <a:noFill/>
+            </a:ln>
+            <a:effectLst/>
+          </c:spPr>
+          <c:invertIfNegative val="0"/>
+          <c:cat>
+            <c:numRef>
+              <c:f>Sheet1!$A$2:$A$9</c:f>
+              <c:numCache>
+                <c:formatCode>General</c:formatCode>
+                <c:ptCount val="8"/>
+                <c:pt idx="0">
+                  <c:v>1</c:v>
+                </c:pt>
+                <c:pt idx="1">
+                  <c:v>2</c:v>
+                </c:pt>
+                <c:pt idx="2">
+                  <c:v>3</c:v>
+                </c:pt>
+                <c:pt idx="3">
+                  <c:v>4</c:v>
+                </c:pt>
+                <c:pt idx="4">
+                  <c:v>5</c:v>
+                </c:pt>
+                <c:pt idx="5">
+                  <c:v>6</c:v>
+                </c:pt>
+                <c:pt idx="6">
+                  <c:v>7</c:v>
+                </c:pt>
+                <c:pt idx="7">
+                  <c:v>8</c:v>
+                </c:pt>
+              </c:numCache>
+            </c:numRef>
+          </c:cat>
+          <c:val>
+            <c:numRef>
+              <c:f>Sheet1!$B$2:$B$9</c:f>
+              <c:numCache>
+                <c:formatCode>General</c:formatCode>
+                <c:ptCount val="8"/>
+                <c:pt idx="0">
+                  <c:v>14733.083000000001</c:v>
+                </c:pt>
+                <c:pt idx="1">
+                  <c:v>11511.912</c:v>
+                </c:pt>
+                <c:pt idx="2">
+                  <c:v>12757.083000000001</c:v>
+                </c:pt>
+                <c:pt idx="3">
+                  <c:v>11586.376</c:v>
+                </c:pt>
+                <c:pt idx="4">
+                  <c:v>2838.3049999999998</c:v>
+                </c:pt>
+                <c:pt idx="5">
+                  <c:v>9836.7900000000009</c:v>
+                </c:pt>
+                <c:pt idx="6">
+                  <c:v>7504.0829999999996</c:v>
+                </c:pt>
+                <c:pt idx="7">
+                  <c:v>6966.0829999999996</c:v>
+                </c:pt>
+              </c:numCache>
+            </c:numRef>
+          </c:val>
+          <c:extLst>
+            <c:ext xmlns:c16="http://schemas.microsoft.com/office/drawing/2014/chart" uri="{C3380CC4-5D6E-409C-BE32-E72D297353CC}">
+              <c16:uniqueId val="{00000000-ED92-4399-9CA8-0BEF556B983C}"/>
+            </c:ext>
+          </c:extLst>
+        </c:ser>
+        <c:dLbls>
+          <c:showLegendKey val="0"/>
+          <c:showVal val="0"/>
+          <c:showCatName val="0"/>
+          <c:showSerName val="0"/>
+          <c:showPercent val="0"/>
+          <c:showBubbleSize val="0"/>
+        </c:dLbls>
+        <c:gapWidth val="219"/>
+        <c:overlap val="-27"/>
+        <c:axId val="1432551007"/>
+        <c:axId val="1432562527"/>
+      </c:barChart>
+      <c:catAx>
+        <c:axId val="1432551007"/>
+        <c:scaling>
+          <c:orientation val="minMax"/>
+        </c:scaling>
+        <c:delete val="0"/>
+        <c:axPos val="b"/>
+        <c:title>
+          <c:tx>
+            <c:rich>
+              <a:bodyPr rot="0" spcFirstLastPara="1" vertOverflow="ellipsis" vert="horz" wrap="square" anchor="ctr" anchorCtr="1"/>
+              <a:lstStyle/>
+              <a:p>
+                <a:pPr>
+                  <a:defRPr sz="1000" b="0" i="0" u="none" strike="noStrike" kern="1200" baseline="0">
+                    <a:solidFill>
+                      <a:schemeClr val="tx1">
+                        <a:lumMod val="65000"/>
+                        <a:lumOff val="35000"/>
+                      </a:schemeClr>
+                    </a:solidFill>
+                    <a:latin typeface="+mn-lt"/>
+                    <a:ea typeface="+mn-ea"/>
+                    <a:cs typeface="+mn-cs"/>
+                  </a:defRPr>
+                </a:pPr>
+                <a:r>
+                  <a:rPr lang="en-US"/>
+                  <a:t>Lane</a:t>
+                </a:r>
+              </a:p>
+            </c:rich>
+          </c:tx>
+          <c:overlay val="0"/>
+          <c:spPr>
+            <a:noFill/>
+            <a:ln>
+              <a:noFill/>
+            </a:ln>
+            <a:effectLst/>
+          </c:spPr>
+          <c:txPr>
+            <a:bodyPr rot="0" spcFirstLastPara="1" vertOverflow="ellipsis" vert="horz" wrap="square" anchor="ctr" anchorCtr="1"/>
+            <a:lstStyle/>
+            <a:p>
+              <a:pPr>
+                <a:defRPr sz="1000" b="0" i="0" u="none" strike="noStrike" kern="1200" baseline="0">
+                  <a:solidFill>
+                    <a:schemeClr val="tx1">
+                      <a:lumMod val="65000"/>
+                      <a:lumOff val="35000"/>
+                    </a:schemeClr>
+                  </a:solidFill>
+                  <a:latin typeface="+mn-lt"/>
+                  <a:ea typeface="+mn-ea"/>
+                  <a:cs typeface="+mn-cs"/>
+                </a:defRPr>
+              </a:pPr>
+              <a:endParaRPr lang="en-US"/>
+            </a:p>
+          </c:txPr>
+        </c:title>
+        <c:numFmt formatCode="General" sourceLinked="1"/>
+        <c:majorTickMark val="none"/>
+        <c:minorTickMark val="none"/>
+        <c:tickLblPos val="nextTo"/>
+        <c:spPr>
+          <a:noFill/>
+          <a:ln w="9525" cap="flat" cmpd="sng" algn="ctr">
+            <a:solidFill>
+              <a:schemeClr val="tx1">
+                <a:lumMod val="15000"/>
+                <a:lumOff val="85000"/>
+              </a:schemeClr>
+            </a:solidFill>
+            <a:round/>
+          </a:ln>
+          <a:effectLst/>
+        </c:spPr>
+        <c:txPr>
+          <a:bodyPr rot="-60000000" spcFirstLastPara="1" vertOverflow="ellipsis" vert="horz" wrap="square" anchor="ctr" anchorCtr="1"/>
+          <a:lstStyle/>
+          <a:p>
+            <a:pPr>
+              <a:defRPr sz="900" b="0" i="0" u="none" strike="noStrike" kern="1200" baseline="0">
+                <a:solidFill>
+                  <a:schemeClr val="tx1">
+                    <a:lumMod val="65000"/>
+                    <a:lumOff val="35000"/>
+                  </a:schemeClr>
+                </a:solidFill>
+                <a:latin typeface="+mn-lt"/>
+                <a:ea typeface="+mn-ea"/>
+                <a:cs typeface="+mn-cs"/>
+              </a:defRPr>
+            </a:pPr>
+            <a:endParaRPr lang="en-US"/>
+          </a:p>
+        </c:txPr>
+        <c:crossAx val="1432562527"/>
+        <c:crosses val="autoZero"/>
+        <c:auto val="1"/>
+        <c:lblAlgn val="ctr"/>
+        <c:lblOffset val="100"/>
+        <c:noMultiLvlLbl val="0"/>
+      </c:catAx>
+      <c:valAx>
+        <c:axId val="1432562527"/>
+        <c:scaling>
+          <c:orientation val="minMax"/>
+        </c:scaling>
+        <c:delete val="0"/>
+        <c:axPos val="l"/>
+        <c:majorGridlines>
+          <c:spPr>
+            <a:ln w="9525" cap="flat" cmpd="sng" algn="ctr">
+              <a:solidFill>
+                <a:schemeClr val="tx1">
+                  <a:lumMod val="15000"/>
+                  <a:lumOff val="85000"/>
+                </a:schemeClr>
+              </a:solidFill>
+              <a:round/>
+            </a:ln>
+            <a:effectLst/>
+          </c:spPr>
+        </c:majorGridlines>
+        <c:title>
+          <c:tx>
+            <c:rich>
+              <a:bodyPr rot="-5400000" spcFirstLastPara="1" vertOverflow="ellipsis" vert="horz" wrap="square" anchor="ctr" anchorCtr="1"/>
+              <a:lstStyle/>
+              <a:p>
+                <a:pPr>
+                  <a:defRPr sz="1000" b="0" i="0" u="none" strike="noStrike" kern="1200" baseline="0">
+                    <a:solidFill>
+                      <a:schemeClr val="tx1">
+                        <a:lumMod val="65000"/>
+                        <a:lumOff val="35000"/>
+                      </a:schemeClr>
+                    </a:solidFill>
+                    <a:latin typeface="+mn-lt"/>
+                    <a:ea typeface="+mn-ea"/>
+                    <a:cs typeface="+mn-cs"/>
+                  </a:defRPr>
+                </a:pPr>
+                <a:r>
+                  <a:rPr lang="en-US"/>
+                  <a:t>Area Under</a:t>
+                </a:r>
+                <a:r>
+                  <a:rPr lang="en-US" baseline="0"/>
+                  <a:t> Curve</a:t>
+                </a:r>
+                <a:endParaRPr lang="en-US"/>
+              </a:p>
+            </c:rich>
+          </c:tx>
+          <c:overlay val="0"/>
+          <c:spPr>
+            <a:noFill/>
+            <a:ln>
+              <a:noFill/>
+            </a:ln>
+            <a:effectLst/>
+          </c:spPr>
+          <c:txPr>
+            <a:bodyPr rot="-5400000" spcFirstLastPara="1" vertOverflow="ellipsis" vert="horz" wrap="square" anchor="ctr" anchorCtr="1"/>
+            <a:lstStyle/>
+            <a:p>
+              <a:pPr>
+                <a:defRPr sz="1000" b="0" i="0" u="none" strike="noStrike" kern="1200" baseline="0">
+                  <a:solidFill>
+                    <a:schemeClr val="tx1">
+                      <a:lumMod val="65000"/>
+                      <a:lumOff val="35000"/>
+                    </a:schemeClr>
+                  </a:solidFill>
+                  <a:latin typeface="+mn-lt"/>
+                  <a:ea typeface="+mn-ea"/>
+                  <a:cs typeface="+mn-cs"/>
+                </a:defRPr>
+              </a:pPr>
+              <a:endParaRPr lang="en-US"/>
+            </a:p>
+          </c:txPr>
+        </c:title>
+        <c:numFmt formatCode="General" sourceLinked="1"/>
+        <c:majorTickMark val="none"/>
+        <c:minorTickMark val="none"/>
+        <c:tickLblPos val="nextTo"/>
+        <c:spPr>
+          <a:noFill/>
+          <a:ln>
+            <a:noFill/>
+          </a:ln>
+          <a:effectLst/>
+        </c:spPr>
+        <c:txPr>
+          <a:bodyPr rot="-60000000" spcFirstLastPara="1" vertOverflow="ellipsis" vert="horz" wrap="square" anchor="ctr" anchorCtr="1"/>
+          <a:lstStyle/>
+          <a:p>
+            <a:pPr>
+              <a:defRPr sz="900" b="0" i="0" u="none" strike="noStrike" kern="1200" baseline="0">
+                <a:solidFill>
+                  <a:schemeClr val="tx1">
+                    <a:lumMod val="65000"/>
+                    <a:lumOff val="35000"/>
+                  </a:schemeClr>
+                </a:solidFill>
+                <a:latin typeface="+mn-lt"/>
+                <a:ea typeface="+mn-ea"/>
+                <a:cs typeface="+mn-cs"/>
+              </a:defRPr>
+            </a:pPr>
+            <a:endParaRPr lang="en-US"/>
+          </a:p>
+        </c:txPr>
+        <c:crossAx val="1432551007"/>
+        <c:crosses val="autoZero"/>
+        <c:crossBetween val="between"/>
+      </c:valAx>
+      <c:spPr>
+        <a:noFill/>
+        <a:ln>
+          <a:noFill/>
+        </a:ln>
+        <a:effectLst/>
+      </c:spPr>
+    </c:plotArea>
+    <c:plotVisOnly val="1"/>
+    <c:dispBlanksAs val="gap"/>
+    <c:showDLblsOverMax val="0"/>
+  </c:chart>
+  <c:spPr>
+    <a:solidFill>
+      <a:schemeClr val="bg1"/>
+    </a:solidFill>
+    <a:ln w="9525" cap="flat" cmpd="sng" algn="ctr">
+      <a:solidFill>
+        <a:schemeClr val="tx1">
+          <a:lumMod val="15000"/>
+          <a:lumOff val="85000"/>
+        </a:schemeClr>
+      </a:solidFill>
+      <a:round/>
+    </a:ln>
+    <a:effectLst/>
+  </c:spPr>
+  <c:txPr>
+    <a:bodyPr/>
+    <a:lstStyle/>
+    <a:p>
+      <a:pPr>
+        <a:defRPr/>
+      </a:pPr>
+      <a:endParaRPr lang="en-US"/>
+    </a:p>
+  </c:txPr>
+  <c:externalData r:id="rId3">
+    <c:autoUpdate val="0"/>
+  </c:externalData>
+</c:chartSpace>
+</file>
+
+<file path=word/charts/chart2.xml><?xml version="1.0" encoding="utf-8"?>
+<c:chartSpace xmlns:c="http://schemas.openxmlformats.org/drawingml/2006/chart" xmlns:a="http://schemas.openxmlformats.org/drawingml/2006/main" xmlns:r="http://schemas.openxmlformats.org/officeDocument/2006/relationships" xmlns:c16r2="http://schemas.microsoft.com/office/drawing/2015/06/chart">
+  <c:date1904 val="0"/>
+  <c:lang val="en-US"/>
+  <c:roundedCorners val="0"/>
+  <mc:AlternateContent xmlns:mc="http://schemas.openxmlformats.org/markup-compatibility/2006">
+    <mc:Choice xmlns:c14="http://schemas.microsoft.com/office/drawing/2007/8/2/chart" Requires="c14">
+      <c14:style val="102"/>
+    </mc:Choice>
+    <mc:Fallback>
+      <c:style val="2"/>
+    </mc:Fallback>
+  </mc:AlternateContent>
+  <c:chart>
+    <c:title>
+      <c:tx>
+        <c:rich>
+          <a:bodyPr rot="0" spcFirstLastPara="1" vertOverflow="ellipsis" vert="horz" wrap="square" anchor="ctr" anchorCtr="1"/>
+          <a:lstStyle/>
+          <a:p>
+            <a:pPr>
+              <a:defRPr sz="1400" b="0" i="0" u="none" strike="noStrike" kern="1200" spc="0" baseline="0">
+                <a:solidFill>
+                  <a:schemeClr val="tx1">
+                    <a:lumMod val="65000"/>
+                    <a:lumOff val="35000"/>
+                  </a:schemeClr>
+                </a:solidFill>
+                <a:latin typeface="+mn-lt"/>
+                <a:ea typeface="+mn-ea"/>
+                <a:cs typeface="+mn-cs"/>
+              </a:defRPr>
+            </a:pPr>
+            <a:r>
+              <a:rPr lang="en-US"/>
+              <a:t>Western Blot 1 (Normalized to Loading Control)</a:t>
+            </a:r>
+          </a:p>
+        </c:rich>
+      </c:tx>
+      <c:overlay val="0"/>
+      <c:spPr>
+        <a:noFill/>
+        <a:ln>
+          <a:noFill/>
+        </a:ln>
+        <a:effectLst/>
+      </c:spPr>
+      <c:txPr>
+        <a:bodyPr rot="0" spcFirstLastPara="1" vertOverflow="ellipsis" vert="horz" wrap="square" anchor="ctr" anchorCtr="1"/>
+        <a:lstStyle/>
+        <a:p>
+          <a:pPr>
+            <a:defRPr sz="1400" b="0" i="0" u="none" strike="noStrike" kern="1200" spc="0" baseline="0">
+              <a:solidFill>
+                <a:schemeClr val="tx1">
+                  <a:lumMod val="65000"/>
+                  <a:lumOff val="35000"/>
+                </a:schemeClr>
+              </a:solidFill>
+              <a:latin typeface="+mn-lt"/>
+              <a:ea typeface="+mn-ea"/>
+              <a:cs typeface="+mn-cs"/>
+            </a:defRPr>
+          </a:pPr>
+          <a:endParaRPr lang="en-US"/>
+        </a:p>
+      </c:txPr>
+    </c:title>
+    <c:autoTitleDeleted val="0"/>
+    <c:plotArea>
+      <c:layout/>
+      <c:barChart>
+        <c:barDir val="col"/>
+        <c:grouping val="clustered"/>
+        <c:varyColors val="0"/>
+        <c:ser>
+          <c:idx val="0"/>
+          <c:order val="0"/>
+          <c:tx>
+            <c:strRef>
+              <c:f>Sheet1!$B$24</c:f>
+              <c:strCache>
+                <c:ptCount val="1"/>
+                <c:pt idx="0">
+                  <c:v>Area Under Curve</c:v>
+                </c:pt>
+              </c:strCache>
+            </c:strRef>
+          </c:tx>
+          <c:spPr>
+            <a:solidFill>
+              <a:schemeClr val="accent1"/>
+            </a:solidFill>
+            <a:ln>
+              <a:noFill/>
+            </a:ln>
+            <a:effectLst/>
+          </c:spPr>
+          <c:invertIfNegative val="0"/>
+          <c:cat>
+            <c:numRef>
+              <c:f>Sheet1!$A$25:$A$32</c:f>
+              <c:numCache>
+                <c:formatCode>General</c:formatCode>
+                <c:ptCount val="8"/>
+                <c:pt idx="0">
+                  <c:v>1</c:v>
+                </c:pt>
+                <c:pt idx="1">
+                  <c:v>2</c:v>
+                </c:pt>
+                <c:pt idx="2">
+                  <c:v>3</c:v>
+                </c:pt>
+                <c:pt idx="3">
+                  <c:v>4</c:v>
+                </c:pt>
+                <c:pt idx="4">
+                  <c:v>5</c:v>
+                </c:pt>
+                <c:pt idx="5">
+                  <c:v>6</c:v>
+                </c:pt>
+                <c:pt idx="6">
+                  <c:v>7</c:v>
+                </c:pt>
+                <c:pt idx="7">
+                  <c:v>8</c:v>
+                </c:pt>
+              </c:numCache>
+            </c:numRef>
+          </c:cat>
+          <c:val>
+            <c:numRef>
+              <c:f>Sheet1!$B$25:$B$32</c:f>
+              <c:numCache>
+                <c:formatCode>General</c:formatCode>
+                <c:ptCount val="8"/>
+                <c:pt idx="0">
+                  <c:v>1.7528523099674547</c:v>
+                </c:pt>
+                <c:pt idx="1">
+                  <c:v>0.94320636737988583</c:v>
+                </c:pt>
+                <c:pt idx="2">
+                  <c:v>1.1303446248329347</c:v>
+                </c:pt>
+                <c:pt idx="3">
+                  <c:v>0.7467449556875454</c:v>
+                </c:pt>
+                <c:pt idx="4">
+                  <c:v>0.18368573518366146</c:v>
+                </c:pt>
+                <c:pt idx="5">
+                  <c:v>1.1990468854771807</c:v>
+                </c:pt>
+                <c:pt idx="6">
+                  <c:v>0.45257692787858717</c:v>
+                </c:pt>
+                <c:pt idx="7">
+                  <c:v>0.48282565391391857</c:v>
+                </c:pt>
+              </c:numCache>
+            </c:numRef>
+          </c:val>
+          <c:extLst>
+            <c:ext xmlns:c16="http://schemas.microsoft.com/office/drawing/2014/chart" uri="{C3380CC4-5D6E-409C-BE32-E72D297353CC}">
+              <c16:uniqueId val="{00000000-93EE-4B6D-AC79-150EADD793B9}"/>
+            </c:ext>
+          </c:extLst>
+        </c:ser>
+        <c:dLbls>
+          <c:showLegendKey val="0"/>
+          <c:showVal val="0"/>
+          <c:showCatName val="0"/>
+          <c:showSerName val="0"/>
+          <c:showPercent val="0"/>
+          <c:showBubbleSize val="0"/>
+        </c:dLbls>
+        <c:gapWidth val="219"/>
+        <c:overlap val="-27"/>
+        <c:axId val="1432528927"/>
+        <c:axId val="1432523167"/>
+      </c:barChart>
+      <c:catAx>
+        <c:axId val="1432528927"/>
+        <c:scaling>
+          <c:orientation val="minMax"/>
+        </c:scaling>
+        <c:delete val="0"/>
+        <c:axPos val="b"/>
+        <c:title>
+          <c:tx>
+            <c:rich>
+              <a:bodyPr rot="0" spcFirstLastPara="1" vertOverflow="ellipsis" vert="horz" wrap="square" anchor="ctr" anchorCtr="1"/>
+              <a:lstStyle/>
+              <a:p>
+                <a:pPr>
+                  <a:defRPr sz="1000" b="0" i="0" u="none" strike="noStrike" kern="1200" baseline="0">
+                    <a:solidFill>
+                      <a:schemeClr val="tx1">
+                        <a:lumMod val="65000"/>
+                        <a:lumOff val="35000"/>
+                      </a:schemeClr>
+                    </a:solidFill>
+                    <a:latin typeface="+mn-lt"/>
+                    <a:ea typeface="+mn-ea"/>
+                    <a:cs typeface="+mn-cs"/>
+                  </a:defRPr>
+                </a:pPr>
+                <a:r>
+                  <a:rPr lang="en-US"/>
+                  <a:t>Lane</a:t>
+                </a:r>
+              </a:p>
+            </c:rich>
+          </c:tx>
+          <c:overlay val="0"/>
+          <c:spPr>
+            <a:noFill/>
+            <a:ln>
+              <a:noFill/>
+            </a:ln>
+            <a:effectLst/>
+          </c:spPr>
+          <c:txPr>
+            <a:bodyPr rot="0" spcFirstLastPara="1" vertOverflow="ellipsis" vert="horz" wrap="square" anchor="ctr" anchorCtr="1"/>
+            <a:lstStyle/>
+            <a:p>
+              <a:pPr>
+                <a:defRPr sz="1000" b="0" i="0" u="none" strike="noStrike" kern="1200" baseline="0">
+                  <a:solidFill>
+                    <a:schemeClr val="tx1">
+                      <a:lumMod val="65000"/>
+                      <a:lumOff val="35000"/>
+                    </a:schemeClr>
+                  </a:solidFill>
+                  <a:latin typeface="+mn-lt"/>
+                  <a:ea typeface="+mn-ea"/>
+                  <a:cs typeface="+mn-cs"/>
+                </a:defRPr>
+              </a:pPr>
+              <a:endParaRPr lang="en-US"/>
+            </a:p>
+          </c:txPr>
+        </c:title>
+        <c:numFmt formatCode="General" sourceLinked="1"/>
+        <c:majorTickMark val="none"/>
+        <c:minorTickMark val="none"/>
+        <c:tickLblPos val="nextTo"/>
+        <c:spPr>
+          <a:noFill/>
+          <a:ln w="9525" cap="flat" cmpd="sng" algn="ctr">
+            <a:solidFill>
+              <a:schemeClr val="tx1">
+                <a:lumMod val="15000"/>
+                <a:lumOff val="85000"/>
+              </a:schemeClr>
+            </a:solidFill>
+            <a:round/>
+          </a:ln>
+          <a:effectLst/>
+        </c:spPr>
+        <c:txPr>
+          <a:bodyPr rot="-60000000" spcFirstLastPara="1" vertOverflow="ellipsis" vert="horz" wrap="square" anchor="ctr" anchorCtr="1"/>
+          <a:lstStyle/>
+          <a:p>
+            <a:pPr>
+              <a:defRPr sz="900" b="0" i="0" u="none" strike="noStrike" kern="1200" baseline="0">
+                <a:solidFill>
+                  <a:schemeClr val="tx1">
+                    <a:lumMod val="65000"/>
+                    <a:lumOff val="35000"/>
+                  </a:schemeClr>
+                </a:solidFill>
+                <a:latin typeface="+mn-lt"/>
+                <a:ea typeface="+mn-ea"/>
+                <a:cs typeface="+mn-cs"/>
+              </a:defRPr>
+            </a:pPr>
+            <a:endParaRPr lang="en-US"/>
+          </a:p>
+        </c:txPr>
+        <c:crossAx val="1432523167"/>
+        <c:crosses val="autoZero"/>
+        <c:auto val="1"/>
+        <c:lblAlgn val="ctr"/>
+        <c:lblOffset val="100"/>
+        <c:noMultiLvlLbl val="0"/>
+      </c:catAx>
+      <c:valAx>
+        <c:axId val="1432523167"/>
+        <c:scaling>
+          <c:orientation val="minMax"/>
+        </c:scaling>
+        <c:delete val="0"/>
+        <c:axPos val="l"/>
+        <c:majorGridlines>
+          <c:spPr>
+            <a:ln w="9525" cap="flat" cmpd="sng" algn="ctr">
+              <a:solidFill>
+                <a:schemeClr val="tx1">
+                  <a:lumMod val="15000"/>
+                  <a:lumOff val="85000"/>
+                </a:schemeClr>
+              </a:solidFill>
+              <a:round/>
+            </a:ln>
+            <a:effectLst/>
+          </c:spPr>
+        </c:majorGridlines>
+        <c:title>
+          <c:tx>
+            <c:rich>
+              <a:bodyPr rot="-5400000" spcFirstLastPara="1" vertOverflow="ellipsis" vert="horz" wrap="square" anchor="ctr" anchorCtr="1"/>
+              <a:lstStyle/>
+              <a:p>
+                <a:pPr>
+                  <a:defRPr sz="1000" b="0" i="0" u="none" strike="noStrike" kern="1200" baseline="0">
+                    <a:solidFill>
+                      <a:schemeClr val="tx1">
+                        <a:lumMod val="65000"/>
+                        <a:lumOff val="35000"/>
+                      </a:schemeClr>
+                    </a:solidFill>
+                    <a:latin typeface="+mn-lt"/>
+                    <a:ea typeface="+mn-ea"/>
+                    <a:cs typeface="+mn-cs"/>
+                  </a:defRPr>
+                </a:pPr>
+                <a:r>
+                  <a:rPr lang="en-US"/>
+                  <a:t>Area Under Curve</a:t>
+                </a:r>
+              </a:p>
+            </c:rich>
+          </c:tx>
+          <c:overlay val="0"/>
+          <c:spPr>
+            <a:noFill/>
+            <a:ln>
+              <a:noFill/>
+            </a:ln>
+            <a:effectLst/>
+          </c:spPr>
+          <c:txPr>
+            <a:bodyPr rot="-5400000" spcFirstLastPara="1" vertOverflow="ellipsis" vert="horz" wrap="square" anchor="ctr" anchorCtr="1"/>
+            <a:lstStyle/>
+            <a:p>
+              <a:pPr>
+                <a:defRPr sz="1000" b="0" i="0" u="none" strike="noStrike" kern="1200" baseline="0">
+                  <a:solidFill>
+                    <a:schemeClr val="tx1">
+                      <a:lumMod val="65000"/>
+                      <a:lumOff val="35000"/>
+                    </a:schemeClr>
+                  </a:solidFill>
+                  <a:latin typeface="+mn-lt"/>
+                  <a:ea typeface="+mn-ea"/>
+                  <a:cs typeface="+mn-cs"/>
+                </a:defRPr>
+              </a:pPr>
+              <a:endParaRPr lang="en-US"/>
+            </a:p>
+          </c:txPr>
+        </c:title>
+        <c:numFmt formatCode="General" sourceLinked="1"/>
+        <c:majorTickMark val="none"/>
+        <c:minorTickMark val="none"/>
+        <c:tickLblPos val="nextTo"/>
+        <c:spPr>
+          <a:noFill/>
+          <a:ln>
+            <a:noFill/>
+          </a:ln>
+          <a:effectLst/>
+        </c:spPr>
+        <c:txPr>
+          <a:bodyPr rot="-60000000" spcFirstLastPara="1" vertOverflow="ellipsis" vert="horz" wrap="square" anchor="ctr" anchorCtr="1"/>
+          <a:lstStyle/>
+          <a:p>
+            <a:pPr>
+              <a:defRPr sz="900" b="0" i="0" u="none" strike="noStrike" kern="1200" baseline="0">
+                <a:solidFill>
+                  <a:schemeClr val="tx1">
+                    <a:lumMod val="65000"/>
+                    <a:lumOff val="35000"/>
+                  </a:schemeClr>
+                </a:solidFill>
+                <a:latin typeface="+mn-lt"/>
+                <a:ea typeface="+mn-ea"/>
+                <a:cs typeface="+mn-cs"/>
+              </a:defRPr>
+            </a:pPr>
+            <a:endParaRPr lang="en-US"/>
+          </a:p>
+        </c:txPr>
+        <c:crossAx val="1432528927"/>
+        <c:crosses val="autoZero"/>
+        <c:crossBetween val="between"/>
+      </c:valAx>
+      <c:spPr>
+        <a:noFill/>
+        <a:ln>
+          <a:noFill/>
+        </a:ln>
+        <a:effectLst/>
+      </c:spPr>
+    </c:plotArea>
+    <c:plotVisOnly val="1"/>
+    <c:dispBlanksAs val="gap"/>
+    <c:showDLblsOverMax val="0"/>
+  </c:chart>
+  <c:spPr>
+    <a:solidFill>
+      <a:schemeClr val="bg1"/>
+    </a:solidFill>
+    <a:ln w="9525" cap="flat" cmpd="sng" algn="ctr">
+      <a:solidFill>
+        <a:schemeClr val="tx1">
+          <a:lumMod val="15000"/>
+          <a:lumOff val="85000"/>
+        </a:schemeClr>
+      </a:solidFill>
+      <a:round/>
+    </a:ln>
+    <a:effectLst/>
+  </c:spPr>
+  <c:txPr>
+    <a:bodyPr/>
+    <a:lstStyle/>
+    <a:p>
+      <a:pPr>
+        <a:defRPr/>
+      </a:pPr>
+      <a:endParaRPr lang="en-US"/>
+    </a:p>
+  </c:txPr>
+  <c:externalData r:id="rId3">
+    <c:autoUpdate val="0"/>
+  </c:externalData>
+</c:chartSpace>
+</file>
+
+<file path=word/charts/colors1.xml><?xml version="1.0" encoding="utf-8"?>
+<cs:colorStyle xmlns:cs="http://schemas.microsoft.com/office/drawing/2012/chartStyle" xmlns:a="http://schemas.openxmlformats.org/drawingml/2006/main" meth="cycle" id="10">
+  <a:schemeClr val="accent1"/>
+  <a:schemeClr val="accent2"/>
+  <a:schemeClr val="accent3"/>
+  <a:schemeClr val="accent4"/>
+  <a:schemeClr val="accent5"/>
+  <a:schemeClr val="accent6"/>
+  <cs:variation/>
+  <cs:variation>
+    <a:lumMod val="60000"/>
+  </cs:variation>
+  <cs:variation>
+    <a:lumMod val="80000"/>
+    <a:lumOff val="20000"/>
+  </cs:variation>
+  <cs:variation>
+    <a:lumMod val="80000"/>
+  </cs:variation>
+  <cs:variation>
+    <a:lumMod val="60000"/>
+    <a:lumOff val="40000"/>
+  </cs:variation>
+  <cs:variation>
+    <a:lumMod val="50000"/>
+  </cs:variation>
+  <cs:variation>
+    <a:lumMod val="70000"/>
+    <a:lumOff val="30000"/>
+  </cs:variation>
+  <cs:variation>
+    <a:lumMod val="70000"/>
+  </cs:variation>
+  <cs:variation>
+    <a:lumMod val="50000"/>
+    <a:lumOff val="50000"/>
+  </cs:variation>
+</cs:colorStyle>
+</file>
+
+<file path=word/charts/colors2.xml><?xml version="1.0" encoding="utf-8"?>
+<cs:colorStyle xmlns:cs="http://schemas.microsoft.com/office/drawing/2012/chartStyle" xmlns:a="http://schemas.openxmlformats.org/drawingml/2006/main" meth="cycle" id="10">
+  <a:schemeClr val="accent1"/>
+  <a:schemeClr val="accent2"/>
+  <a:schemeClr val="accent3"/>
+  <a:schemeClr val="accent4"/>
+  <a:schemeClr val="accent5"/>
+  <a:schemeClr val="accent6"/>
+  <cs:variation/>
+  <cs:variation>
+    <a:lumMod val="60000"/>
+  </cs:variation>
+  <cs:variation>
+    <a:lumMod val="80000"/>
+    <a:lumOff val="20000"/>
+  </cs:variation>
+  <cs:variation>
+    <a:lumMod val="80000"/>
+  </cs:variation>
+  <cs:variation>
+    <a:lumMod val="60000"/>
+    <a:lumOff val="40000"/>
+  </cs:variation>
+  <cs:variation>
+    <a:lumMod val="50000"/>
+  </cs:variation>
+  <cs:variation>
+    <a:lumMod val="70000"/>
+    <a:lumOff val="30000"/>
+  </cs:variation>
+  <cs:variation>
+    <a:lumMod val="70000"/>
+  </cs:variation>
+  <cs:variation>
+    <a:lumMod val="50000"/>
+    <a:lumOff val="50000"/>
+  </cs:variation>
+</cs:colorStyle>
+</file>
+
+<file path=word/charts/style1.xml><?xml version="1.0" encoding="utf-8"?>
+<cs:chartStyle xmlns:cs="http://schemas.microsoft.com/office/drawing/2012/chartStyle" xmlns:a="http://schemas.openxmlformats.org/drawingml/2006/main" id="201">
+  <cs:axisTitle>
+    <cs:lnRef idx="0"/>
+    <cs:fillRef idx="0"/>
+    <cs:effectRef idx="0"/>
+    <cs:fontRef idx="minor">
+      <a:schemeClr val="tx1">
+        <a:lumMod val="65000"/>
+        <a:lumOff val="35000"/>
+      </a:schemeClr>
+    </cs:fontRef>
+    <cs:defRPr sz="1000" kern="1200"/>
+  </cs:axisTitle>
+  <cs:categoryAxis>
+    <cs:lnRef idx="0"/>
+    <cs:fillRef idx="0"/>
+    <cs:effectRef idx="0"/>
+    <cs:fontRef idx="minor">
+      <a:schemeClr val="tx1">
+        <a:lumMod val="65000"/>
+        <a:lumOff val="35000"/>
+      </a:schemeClr>
+    </cs:fontRef>
+    <cs:spPr>
+      <a:ln w="9525" cap="flat" cmpd="sng" algn="ctr">
+        <a:solidFill>
+          <a:schemeClr val="tx1">
+            <a:lumMod val="15000"/>
+            <a:lumOff val="85000"/>
+          </a:schemeClr>
+        </a:solidFill>
+        <a:round/>
+      </a:ln>
+    </cs:spPr>
+    <cs:defRPr sz="900" kern="1200"/>
+  </cs:categoryAxis>
+  <cs:chartArea mods="allowNoFillOverride allowNoLineOverride">
+    <cs:lnRef idx="0"/>
+    <cs:fillRef idx="0"/>
+    <cs:effectRef idx="0"/>
+    <cs:fontRef idx="minor">
+      <a:schemeClr val="tx1"/>
+    </cs:fontRef>
+    <cs:spPr>
+      <a:solidFill>
+        <a:schemeClr val="bg1"/>
+      </a:solidFill>
+      <a:ln w="9525" cap="flat" cmpd="sng" algn="ctr">
+        <a:solidFill>
+          <a:schemeClr val="tx1">
+            <a:lumMod val="15000"/>
+            <a:lumOff val="85000"/>
+          </a:schemeClr>
+        </a:solidFill>
+        <a:round/>
+      </a:ln>
+    </cs:spPr>
+    <cs:defRPr sz="1000" kern="1200"/>
+  </cs:chartArea>
+  <cs:dataLabel>
+    <cs:lnRef idx="0"/>
+    <cs:fillRef idx="0"/>
+    <cs:effectRef idx="0"/>
+    <cs:fontRef idx="minor">
+      <a:schemeClr val="tx1">
+        <a:lumMod val="75000"/>
+        <a:lumOff val="25000"/>
+      </a:schemeClr>
+    </cs:fontRef>
+    <cs:defRPr sz="900" kern="1200"/>
+  </cs:dataLabel>
+  <cs:dataLabelCallout>
+    <cs:lnRef idx="0"/>
+    <cs:fillRef idx="0"/>
+    <cs:effectRef idx="0"/>
+    <cs:fontRef idx="minor">
+      <a:schemeClr val="dk1">
+        <a:lumMod val="65000"/>
+        <a:lumOff val="35000"/>
+      </a:schemeClr>
+    </cs:fontRef>
+    <cs:spPr>
+      <a:solidFill>
+        <a:schemeClr val="lt1"/>
+      </a:solidFill>
+      <a:ln>
+        <a:solidFill>
+          <a:schemeClr val="dk1">
+            <a:lumMod val="25000"/>
+            <a:lumOff val="75000"/>
+          </a:schemeClr>
+        </a:solidFill>
+      </a:ln>
+    </cs:spPr>
+    <cs:defRPr sz="900" kern="1200"/>
+    <cs:bodyPr rot="0" spcFirstLastPara="1" vertOverflow="clip" horzOverflow="clip" vert="horz" wrap="square" lIns="36576" tIns="18288" rIns="36576" bIns="18288" anchor="ctr" anchorCtr="1">
+      <a:spAutoFit/>
+    </cs:bodyPr>
+  </cs:dataLabelCallout>
+  <cs:dataPoint>
+    <cs:lnRef idx="0"/>
+    <cs:fillRef idx="1">
+      <cs:styleClr val="auto"/>
+    </cs:fillRef>
+    <cs:effectRef idx="0"/>
+    <cs:fontRef idx="minor">
+      <a:schemeClr val="tx1"/>
+    </cs:fontRef>
+  </cs:dataPoint>
+  <cs:dataPoint3D>
+    <cs:lnRef idx="0"/>
+    <cs:fillRef idx="1">
+      <cs:styleClr val="auto"/>
+    </cs:fillRef>
+    <cs:effectRef idx="0"/>
+    <cs:fontRef idx="minor">
+      <a:schemeClr val="tx1"/>
+    </cs:fontRef>
+  </cs:dataPoint3D>
+  <cs:dataPointLine>
+    <cs:lnRef idx="0">
+      <cs:styleClr val="auto"/>
+    </cs:lnRef>
+    <cs:fillRef idx="1"/>
+    <cs:effectRef idx="0"/>
+    <cs:fontRef idx="minor">
+      <a:schemeClr val="tx1"/>
+    </cs:fontRef>
+    <cs:spPr>
+      <a:ln w="28575" cap="rnd">
+        <a:solidFill>
+          <a:schemeClr val="phClr"/>
+        </a:solidFill>
+        <a:round/>
+      </a:ln>
+    </cs:spPr>
+  </cs:dataPointLine>
+  <cs:dataPointMarker>
+    <cs:lnRef idx="0">
+      <cs:styleClr val="auto"/>
+    </cs:lnRef>
+    <cs:fillRef idx="1">
+      <cs:styleClr val="auto"/>
+    </cs:fillRef>
+    <cs:effectRef idx="0"/>
+    <cs:fontRef idx="minor">
+      <a:schemeClr val="tx1"/>
+    </cs:fontRef>
+    <cs:spPr>
+      <a:ln w="9525">
+        <a:solidFill>
+          <a:schemeClr val="phClr"/>
+        </a:solidFill>
+      </a:ln>
+    </cs:spPr>
+  </cs:dataPointMarker>
+  <cs:dataPointMarkerLayout symbol="circle" size="5"/>
+  <cs:dataPointWireframe>
+    <cs:lnRef idx="0">
+      <cs:styleClr val="auto"/>
+    </cs:lnRef>
+    <cs:fillRef idx="1"/>
+    <cs:effectRef idx="0"/>
+    <cs:fontRef idx="minor">
+      <a:schemeClr val="tx1"/>
+    </cs:fontRef>
+    <cs:spPr>
+      <a:ln w="9525" cap="rnd">
+        <a:solidFill>
+          <a:schemeClr val="phClr"/>
+        </a:solidFill>
+        <a:round/>
+      </a:ln>
+    </cs:spPr>
+  </cs:dataPointWireframe>
+  <cs:dataTable>
+    <cs:lnRef idx="0"/>
+    <cs:fillRef idx="0"/>
+    <cs:effectRef idx="0"/>
+    <cs:fontRef idx="minor">
+      <a:schemeClr val="tx1">
+        <a:lumMod val="65000"/>
+        <a:lumOff val="35000"/>
+      </a:schemeClr>
+    </cs:fontRef>
+    <cs:spPr>
+      <a:noFill/>
+      <a:ln w="9525" cap="flat" cmpd="sng" algn="ctr">
+        <a:solidFill>
+          <a:schemeClr val="tx1">
+            <a:lumMod val="15000"/>
+            <a:lumOff val="85000"/>
+          </a:schemeClr>
+        </a:solidFill>
+        <a:round/>
+      </a:ln>
+    </cs:spPr>
+    <cs:defRPr sz="900" kern="1200"/>
+  </cs:dataTable>
+  <cs:downBar>
+    <cs:lnRef idx="0"/>
+    <cs:fillRef idx="0"/>
+    <cs:effectRef idx="0"/>
+    <cs:fontRef idx="minor">
+      <a:schemeClr val="dk1"/>
+    </cs:fontRef>
+    <cs:spPr>
+      <a:solidFill>
+        <a:schemeClr val="dk1">
+          <a:lumMod val="65000"/>
+          <a:lumOff val="35000"/>
+        </a:schemeClr>
+      </a:solidFill>
+      <a:ln w="9525">
+        <a:solidFill>
+          <a:schemeClr val="tx1">
+            <a:lumMod val="65000"/>
+            <a:lumOff val="35000"/>
+          </a:schemeClr>
+        </a:solidFill>
+      </a:ln>
+    </cs:spPr>
+  </cs:downBar>
+  <cs:dropLine>
+    <cs:lnRef idx="0"/>
+    <cs:fillRef idx="0"/>
+    <cs:effectRef idx="0"/>
+    <cs:fontRef idx="minor">
+      <a:schemeClr val="tx1"/>
+    </cs:fontRef>
+    <cs:spPr>
+      <a:ln w="9525" cap="flat" cmpd="sng" algn="ctr">
+        <a:solidFill>
+          <a:schemeClr val="tx1">
+            <a:lumMod val="35000"/>
+            <a:lumOff val="65000"/>
+          </a:schemeClr>
+        </a:solidFill>
+        <a:round/>
+      </a:ln>
+    </cs:spPr>
+  </cs:dropLine>
+  <cs:errorBar>
+    <cs:lnRef idx="0"/>
+    <cs:fillRef idx="0"/>
+    <cs:effectRef idx="0"/>
+    <cs:fontRef idx="minor">
+      <a:schemeClr val="tx1"/>
+    </cs:fontRef>
+    <cs:spPr>
+      <a:ln w="9525" cap="flat" cmpd="sng" algn="ctr">
+        <a:solidFill>
+          <a:schemeClr val="tx1">
+            <a:lumMod val="65000"/>
+            <a:lumOff val="35000"/>
+          </a:schemeClr>
+        </a:solidFill>
+        <a:round/>
+      </a:ln>
+    </cs:spPr>
+  </cs:errorBar>
+  <cs:floor>
+    <cs:lnRef idx="0"/>
+    <cs:fillRef idx="0"/>
+    <cs:effectRef idx="0"/>
+    <cs:fontRef idx="minor">
+      <a:schemeClr val="tx1"/>
+    </cs:fontRef>
+    <cs:spPr>
+      <a:noFill/>
+      <a:ln>
+        <a:noFill/>
+      </a:ln>
+    </cs:spPr>
+  </cs:floor>
+  <cs:gridlineMajor>
+    <cs:lnRef idx="0"/>
+    <cs:fillRef idx="0"/>
+    <cs:effectRef idx="0"/>
+    <cs:fontRef idx="minor">
+      <a:schemeClr val="tx1"/>
+    </cs:fontRef>
+    <cs:spPr>
+      <a:ln w="9525" cap="flat" cmpd="sng" algn="ctr">
+        <a:solidFill>
+          <a:schemeClr val="tx1">
+            <a:lumMod val="15000"/>
+            <a:lumOff val="85000"/>
+          </a:schemeClr>
+        </a:solidFill>
+        <a:round/>
+      </a:ln>
+    </cs:spPr>
+  </cs:gridlineMajor>
+  <cs:gridlineMinor>
+    <cs:lnRef idx="0"/>
+    <cs:fillRef idx="0"/>
+    <cs:effectRef idx="0"/>
+    <cs:fontRef idx="minor">
+      <a:schemeClr val="tx1"/>
+    </cs:fontRef>
+    <cs:spPr>
+      <a:ln w="9525" cap="flat" cmpd="sng" algn="ctr">
+        <a:solidFill>
+          <a:schemeClr val="tx1">
+            <a:lumMod val="5000"/>
+            <a:lumOff val="95000"/>
+          </a:schemeClr>
+        </a:solidFill>
+        <a:round/>
+      </a:ln>
+    </cs:spPr>
+  </cs:gridlineMinor>
+  <cs:hiLoLine>
+    <cs:lnRef idx="0"/>
+    <cs:fillRef idx="0"/>
+    <cs:effectRef idx="0"/>
+    <cs:fontRef idx="minor">
+      <a:schemeClr val="tx1"/>
+    </cs:fontRef>
+    <cs:spPr>
+      <a:ln w="9525" cap="flat" cmpd="sng" algn="ctr">
+        <a:solidFill>
+          <a:schemeClr val="tx1">
+            <a:lumMod val="75000"/>
+            <a:lumOff val="25000"/>
+          </a:schemeClr>
+        </a:solidFill>
+        <a:round/>
+      </a:ln>
+    </cs:spPr>
+  </cs:hiLoLine>
+  <cs:leaderLine>
+    <cs:lnRef idx="0"/>
+    <cs:fillRef idx="0"/>
+    <cs:effectRef idx="0"/>
+    <cs:fontRef idx="minor">
+      <a:schemeClr val="tx1"/>
+    </cs:fontRef>
+    <cs:spPr>
+      <a:ln w="9525" cap="flat" cmpd="sng" algn="ctr">
+        <a:solidFill>
+          <a:schemeClr val="tx1">
+            <a:lumMod val="35000"/>
+            <a:lumOff val="65000"/>
+          </a:schemeClr>
+        </a:solidFill>
+        <a:round/>
+      </a:ln>
+    </cs:spPr>
+  </cs:leaderLine>
+  <cs:legend>
+    <cs:lnRef idx="0"/>
+    <cs:fillRef idx="0"/>
+    <cs:effectRef idx="0"/>
+    <cs:fontRef idx="minor">
+      <a:schemeClr val="tx1">
+        <a:lumMod val="65000"/>
+        <a:lumOff val="35000"/>
+      </a:schemeClr>
+    </cs:fontRef>
+    <cs:defRPr sz="900" kern="1200"/>
+  </cs:legend>
+  <cs:plotArea mods="allowNoFillOverride allowNoLineOverride">
+    <cs:lnRef idx="0"/>
+    <cs:fillRef idx="0"/>
+    <cs:effectRef idx="0"/>
+    <cs:fontRef idx="minor">
+      <a:schemeClr val="tx1"/>
+    </cs:fontRef>
+  </cs:plotArea>
+  <cs:plotArea3D mods="allowNoFillOverride allowNoLineOverride">
+    <cs:lnRef idx="0"/>
+    <cs:fillRef idx="0"/>
+    <cs:effectRef idx="0"/>
+    <cs:fontRef idx="minor">
+      <a:schemeClr val="tx1"/>
+    </cs:fontRef>
+  </cs:plotArea3D>
+  <cs:seriesAxis>
+    <cs:lnRef idx="0"/>
+    <cs:fillRef idx="0"/>
+    <cs:effectRef idx="0"/>
+    <cs:fontRef idx="minor">
+      <a:schemeClr val="tx1">
+        <a:lumMod val="65000"/>
+        <a:lumOff val="35000"/>
+      </a:schemeClr>
+    </cs:fontRef>
+    <cs:defRPr sz="900" kern="1200"/>
+  </cs:seriesAxis>
+  <cs:seriesLine>
+    <cs:lnRef idx="0"/>
+    <cs:fillRef idx="0"/>
+    <cs:effectRef idx="0"/>
+    <cs:fontRef idx="minor">
+      <a:schemeClr val="tx1"/>
+    </cs:fontRef>
+    <cs:spPr>
+      <a:ln w="9525" cap="flat" cmpd="sng" algn="ctr">
+        <a:solidFill>
+          <a:schemeClr val="tx1">
+            <a:lumMod val="35000"/>
+            <a:lumOff val="65000"/>
+          </a:schemeClr>
+        </a:solidFill>
+        <a:round/>
+      </a:ln>
+    </cs:spPr>
+  </cs:seriesLine>
+  <cs:title>
+    <cs:lnRef idx="0"/>
+    <cs:fillRef idx="0"/>
+    <cs:effectRef idx="0"/>
+    <cs:fontRef idx="minor">
+      <a:schemeClr val="tx1">
+        <a:lumMod val="65000"/>
+        <a:lumOff val="35000"/>
+      </a:schemeClr>
+    </cs:fontRef>
+    <cs:defRPr sz="1400" b="0" kern="1200" spc="0" baseline="0"/>
+  </cs:title>
+  <cs:trendline>
+    <cs:lnRef idx="0">
+      <cs:styleClr val="auto"/>
+    </cs:lnRef>
+    <cs:fillRef idx="0"/>
+    <cs:effectRef idx="0"/>
+    <cs:fontRef idx="minor">
+      <a:schemeClr val="tx1"/>
+    </cs:fontRef>
+    <cs:spPr>
+      <a:ln w="19050" cap="rnd">
+        <a:solidFill>
+          <a:schemeClr val="phClr"/>
+        </a:solidFill>
+        <a:prstDash val="sysDot"/>
+      </a:ln>
+    </cs:spPr>
+  </cs:trendline>
+  <cs:trendlineLabel>
+    <cs:lnRef idx="0"/>
+    <cs:fillRef idx="0"/>
+    <cs:effectRef idx="0"/>
+    <cs:fontRef idx="minor">
+      <a:schemeClr val="tx1">
+        <a:lumMod val="65000"/>
+        <a:lumOff val="35000"/>
+      </a:schemeClr>
+    </cs:fontRef>
+    <cs:defRPr sz="900" kern="1200"/>
+  </cs:trendlineLabel>
+  <cs:upBar>
+    <cs:lnRef idx="0"/>
+    <cs:fillRef idx="0"/>
+    <cs:effectRef idx="0"/>
+    <cs:fontRef idx="minor">
+      <a:schemeClr val="dk1"/>
+    </cs:fontRef>
+    <cs:spPr>
+      <a:solidFill>
+        <a:schemeClr val="lt1"/>
+      </a:solidFill>
+      <a:ln w="9525">
+        <a:solidFill>
+          <a:schemeClr val="tx1">
+            <a:lumMod val="15000"/>
+            <a:lumOff val="85000"/>
+          </a:schemeClr>
+        </a:solidFill>
+      </a:ln>
+    </cs:spPr>
+  </cs:upBar>
+  <cs:valueAxis>
+    <cs:lnRef idx="0"/>
+    <cs:fillRef idx="0"/>
+    <cs:effectRef idx="0"/>
+    <cs:fontRef idx="minor">
+      <a:schemeClr val="tx1">
+        <a:lumMod val="65000"/>
+        <a:lumOff val="35000"/>
+      </a:schemeClr>
+    </cs:fontRef>
+    <cs:defRPr sz="900" kern="1200"/>
+  </cs:valueAxis>
+  <cs:wall>
+    <cs:lnRef idx="0"/>
+    <cs:fillRef idx="0"/>
+    <cs:effectRef idx="0"/>
+    <cs:fontRef idx="minor">
+      <a:schemeClr val="tx1"/>
+    </cs:fontRef>
+    <cs:spPr>
+      <a:noFill/>
+      <a:ln>
+        <a:noFill/>
+      </a:ln>
+    </cs:spPr>
+  </cs:wall>
+</cs:chartStyle>
+</file>
+
+<file path=word/charts/style2.xml><?xml version="1.0" encoding="utf-8"?>
+<cs:chartStyle xmlns:cs="http://schemas.microsoft.com/office/drawing/2012/chartStyle" xmlns:a="http://schemas.openxmlformats.org/drawingml/2006/main" id="201">
+  <cs:axisTitle>
+    <cs:lnRef idx="0"/>
+    <cs:fillRef idx="0"/>
+    <cs:effectRef idx="0"/>
+    <cs:fontRef idx="minor">
+      <a:schemeClr val="tx1">
+        <a:lumMod val="65000"/>
+        <a:lumOff val="35000"/>
+      </a:schemeClr>
+    </cs:fontRef>
+    <cs:defRPr sz="1000" kern="1200"/>
+  </cs:axisTitle>
+  <cs:categoryAxis>
+    <cs:lnRef idx="0"/>
+    <cs:fillRef idx="0"/>
+    <cs:effectRef idx="0"/>
+    <cs:fontRef idx="minor">
+      <a:schemeClr val="tx1">
+        <a:lumMod val="65000"/>
+        <a:lumOff val="35000"/>
+      </a:schemeClr>
+    </cs:fontRef>
+    <cs:spPr>
+      <a:ln w="9525" cap="flat" cmpd="sng" algn="ctr">
+        <a:solidFill>
+          <a:schemeClr val="tx1">
+            <a:lumMod val="15000"/>
+            <a:lumOff val="85000"/>
+          </a:schemeClr>
+        </a:solidFill>
+        <a:round/>
+      </a:ln>
+    </cs:spPr>
+    <cs:defRPr sz="900" kern="1200"/>
+  </cs:categoryAxis>
+  <cs:chartArea mods="allowNoFillOverride allowNoLineOverride">
+    <cs:lnRef idx="0"/>
+    <cs:fillRef idx="0"/>
+    <cs:effectRef idx="0"/>
+    <cs:fontRef idx="minor">
+      <a:schemeClr val="tx1"/>
+    </cs:fontRef>
+    <cs:spPr>
+      <a:solidFill>
+        <a:schemeClr val="bg1"/>
+      </a:solidFill>
+      <a:ln w="9525" cap="flat" cmpd="sng" algn="ctr">
+        <a:solidFill>
+          <a:schemeClr val="tx1">
+            <a:lumMod val="15000"/>
+            <a:lumOff val="85000"/>
+          </a:schemeClr>
+        </a:solidFill>
+        <a:round/>
+      </a:ln>
+    </cs:spPr>
+    <cs:defRPr sz="1000" kern="1200"/>
+  </cs:chartArea>
+  <cs:dataLabel>
+    <cs:lnRef idx="0"/>
+    <cs:fillRef idx="0"/>
+    <cs:effectRef idx="0"/>
+    <cs:fontRef idx="minor">
+      <a:schemeClr val="tx1">
+        <a:lumMod val="75000"/>
+        <a:lumOff val="25000"/>
+      </a:schemeClr>
+    </cs:fontRef>
+    <cs:defRPr sz="900" kern="1200"/>
+  </cs:dataLabel>
+  <cs:dataLabelCallout>
+    <cs:lnRef idx="0"/>
+    <cs:fillRef idx="0"/>
+    <cs:effectRef idx="0"/>
+    <cs:fontRef idx="minor">
+      <a:schemeClr val="dk1">
+        <a:lumMod val="65000"/>
+        <a:lumOff val="35000"/>
+      </a:schemeClr>
+    </cs:fontRef>
+    <cs:spPr>
+      <a:solidFill>
+        <a:schemeClr val="lt1"/>
+      </a:solidFill>
+      <a:ln>
+        <a:solidFill>
+          <a:schemeClr val="dk1">
+            <a:lumMod val="25000"/>
+            <a:lumOff val="75000"/>
+          </a:schemeClr>
+        </a:solidFill>
+      </a:ln>
+    </cs:spPr>
+    <cs:defRPr sz="900" kern="1200"/>
+    <cs:bodyPr rot="0" spcFirstLastPara="1" vertOverflow="clip" horzOverflow="clip" vert="horz" wrap="square" lIns="36576" tIns="18288" rIns="36576" bIns="18288" anchor="ctr" anchorCtr="1">
+      <a:spAutoFit/>
+    </cs:bodyPr>
+  </cs:dataLabelCallout>
+  <cs:dataPoint>
+    <cs:lnRef idx="0"/>
+    <cs:fillRef idx="1">
+      <cs:styleClr val="auto"/>
+    </cs:fillRef>
+    <cs:effectRef idx="0"/>
+    <cs:fontRef idx="minor">
+      <a:schemeClr val="tx1"/>
+    </cs:fontRef>
+  </cs:dataPoint>
+  <cs:dataPoint3D>
+    <cs:lnRef idx="0"/>
+    <cs:fillRef idx="1">
+      <cs:styleClr val="auto"/>
+    </cs:fillRef>
+    <cs:effectRef idx="0"/>
+    <cs:fontRef idx="minor">
+      <a:schemeClr val="tx1"/>
+    </cs:fontRef>
+  </cs:dataPoint3D>
+  <cs:dataPointLine>
+    <cs:lnRef idx="0">
+      <cs:styleClr val="auto"/>
+    </cs:lnRef>
+    <cs:fillRef idx="1"/>
+    <cs:effectRef idx="0"/>
+    <cs:fontRef idx="minor">
+      <a:schemeClr val="tx1"/>
+    </cs:fontRef>
+    <cs:spPr>
+      <a:ln w="28575" cap="rnd">
+        <a:solidFill>
+          <a:schemeClr val="phClr"/>
+        </a:solidFill>
+        <a:round/>
+      </a:ln>
+    </cs:spPr>
+  </cs:dataPointLine>
+  <cs:dataPointMarker>
+    <cs:lnRef idx="0">
+      <cs:styleClr val="auto"/>
+    </cs:lnRef>
+    <cs:fillRef idx="1">
+      <cs:styleClr val="auto"/>
+    </cs:fillRef>
+    <cs:effectRef idx="0"/>
+    <cs:fontRef idx="minor">
+      <a:schemeClr val="tx1"/>
+    </cs:fontRef>
+    <cs:spPr>
+      <a:ln w="9525">
+        <a:solidFill>
+          <a:schemeClr val="phClr"/>
+        </a:solidFill>
+      </a:ln>
+    </cs:spPr>
+  </cs:dataPointMarker>
+  <cs:dataPointMarkerLayout symbol="circle" size="5"/>
+  <cs:dataPointWireframe>
+    <cs:lnRef idx="0">
+      <cs:styleClr val="auto"/>
+    </cs:lnRef>
+    <cs:fillRef idx="1"/>
+    <cs:effectRef idx="0"/>
+    <cs:fontRef idx="minor">
+      <a:schemeClr val="tx1"/>
+    </cs:fontRef>
+    <cs:spPr>
+      <a:ln w="9525" cap="rnd">
+        <a:solidFill>
+          <a:schemeClr val="phClr"/>
+        </a:solidFill>
+        <a:round/>
+      </a:ln>
+    </cs:spPr>
+  </cs:dataPointWireframe>
+  <cs:dataTable>
+    <cs:lnRef idx="0"/>
+    <cs:fillRef idx="0"/>
+    <cs:effectRef idx="0"/>
+    <cs:fontRef idx="minor">
+      <a:schemeClr val="tx1">
+        <a:lumMod val="65000"/>
+        <a:lumOff val="35000"/>
+      </a:schemeClr>
+    </cs:fontRef>
+    <cs:spPr>
+      <a:noFill/>
+      <a:ln w="9525" cap="flat" cmpd="sng" algn="ctr">
+        <a:solidFill>
+          <a:schemeClr val="tx1">
+            <a:lumMod val="15000"/>
+            <a:lumOff val="85000"/>
+          </a:schemeClr>
+        </a:solidFill>
+        <a:round/>
+      </a:ln>
+    </cs:spPr>
+    <cs:defRPr sz="900" kern="1200"/>
+  </cs:dataTable>
+  <cs:downBar>
+    <cs:lnRef idx="0"/>
+    <cs:fillRef idx="0"/>
+    <cs:effectRef idx="0"/>
+    <cs:fontRef idx="minor">
+      <a:schemeClr val="dk1"/>
+    </cs:fontRef>
+    <cs:spPr>
+      <a:solidFill>
+        <a:schemeClr val="dk1">
+          <a:lumMod val="65000"/>
+          <a:lumOff val="35000"/>
+        </a:schemeClr>
+      </a:solidFill>
+      <a:ln w="9525">
+        <a:solidFill>
+          <a:schemeClr val="tx1">
+            <a:lumMod val="65000"/>
+            <a:lumOff val="35000"/>
+          </a:schemeClr>
+        </a:solidFill>
+      </a:ln>
+    </cs:spPr>
+  </cs:downBar>
+  <cs:dropLine>
+    <cs:lnRef idx="0"/>
+    <cs:fillRef idx="0"/>
+    <cs:effectRef idx="0"/>
+    <cs:fontRef idx="minor">
+      <a:schemeClr val="tx1"/>
+    </cs:fontRef>
+    <cs:spPr>
+      <a:ln w="9525" cap="flat" cmpd="sng" algn="ctr">
+        <a:solidFill>
+          <a:schemeClr val="tx1">
+            <a:lumMod val="35000"/>
+            <a:lumOff val="65000"/>
+          </a:schemeClr>
+        </a:solidFill>
+        <a:round/>
+      </a:ln>
+    </cs:spPr>
+  </cs:dropLine>
+  <cs:errorBar>
+    <cs:lnRef idx="0"/>
+    <cs:fillRef idx="0"/>
+    <cs:effectRef idx="0"/>
+    <cs:fontRef idx="minor">
+      <a:schemeClr val="tx1"/>
+    </cs:fontRef>
+    <cs:spPr>
+      <a:ln w="9525" cap="flat" cmpd="sng" algn="ctr">
+        <a:solidFill>
+          <a:schemeClr val="tx1">
+            <a:lumMod val="65000"/>
+            <a:lumOff val="35000"/>
+          </a:schemeClr>
+        </a:solidFill>
+        <a:round/>
+      </a:ln>
+    </cs:spPr>
+  </cs:errorBar>
+  <cs:floor>
+    <cs:lnRef idx="0"/>
+    <cs:fillRef idx="0"/>
+    <cs:effectRef idx="0"/>
+    <cs:fontRef idx="minor">
+      <a:schemeClr val="tx1"/>
+    </cs:fontRef>
+    <cs:spPr>
+      <a:noFill/>
+      <a:ln>
+        <a:noFill/>
+      </a:ln>
+    </cs:spPr>
+  </cs:floor>
+  <cs:gridlineMajor>
+    <cs:lnRef idx="0"/>
+    <cs:fillRef idx="0"/>
+    <cs:effectRef idx="0"/>
+    <cs:fontRef idx="minor">
+      <a:schemeClr val="tx1"/>
+    </cs:fontRef>
+    <cs:spPr>
+      <a:ln w="9525" cap="flat" cmpd="sng" algn="ctr">
+        <a:solidFill>
+          <a:schemeClr val="tx1">
+            <a:lumMod val="15000"/>
+            <a:lumOff val="85000"/>
+          </a:schemeClr>
+        </a:solidFill>
+        <a:round/>
+      </a:ln>
+    </cs:spPr>
+  </cs:gridlineMajor>
+  <cs:gridlineMinor>
+    <cs:lnRef idx="0"/>
+    <cs:fillRef idx="0"/>
+    <cs:effectRef idx="0"/>
+    <cs:fontRef idx="minor">
+      <a:schemeClr val="tx1"/>
+    </cs:fontRef>
+    <cs:spPr>
+      <a:ln w="9525" cap="flat" cmpd="sng" algn="ctr">
+        <a:solidFill>
+          <a:schemeClr val="tx1">
+            <a:lumMod val="5000"/>
+            <a:lumOff val="95000"/>
+          </a:schemeClr>
+        </a:solidFill>
+        <a:round/>
+      </a:ln>
+    </cs:spPr>
+  </cs:gridlineMinor>
+  <cs:hiLoLine>
+    <cs:lnRef idx="0"/>
+    <cs:fillRef idx="0"/>
+    <cs:effectRef idx="0"/>
+    <cs:fontRef idx="minor">
+      <a:schemeClr val="tx1"/>
+    </cs:fontRef>
+    <cs:spPr>
+      <a:ln w="9525" cap="flat" cmpd="sng" algn="ctr">
+        <a:solidFill>
+          <a:schemeClr val="tx1">
+            <a:lumMod val="75000"/>
+            <a:lumOff val="25000"/>
+          </a:schemeClr>
+        </a:solidFill>
+        <a:round/>
+      </a:ln>
+    </cs:spPr>
+  </cs:hiLoLine>
+  <cs:leaderLine>
+    <cs:lnRef idx="0"/>
+    <cs:fillRef idx="0"/>
+    <cs:effectRef idx="0"/>
+    <cs:fontRef idx="minor">
+      <a:schemeClr val="tx1"/>
+    </cs:fontRef>
+    <cs:spPr>
+      <a:ln w="9525" cap="flat" cmpd="sng" algn="ctr">
+        <a:solidFill>
+          <a:schemeClr val="tx1">
+            <a:lumMod val="35000"/>
+            <a:lumOff val="65000"/>
+          </a:schemeClr>
+        </a:solidFill>
+        <a:round/>
+      </a:ln>
+    </cs:spPr>
+  </cs:leaderLine>
+  <cs:legend>
+    <cs:lnRef idx="0"/>
+    <cs:fillRef idx="0"/>
+    <cs:effectRef idx="0"/>
+    <cs:fontRef idx="minor">
+      <a:schemeClr val="tx1">
+        <a:lumMod val="65000"/>
+        <a:lumOff val="35000"/>
+      </a:schemeClr>
+    </cs:fontRef>
+    <cs:defRPr sz="900" kern="1200"/>
+  </cs:legend>
+  <cs:plotArea mods="allowNoFillOverride allowNoLineOverride">
+    <cs:lnRef idx="0"/>
+    <cs:fillRef idx="0"/>
+    <cs:effectRef idx="0"/>
+    <cs:fontRef idx="minor">
+      <a:schemeClr val="tx1"/>
+    </cs:fontRef>
+  </cs:plotArea>
+  <cs:plotArea3D mods="allowNoFillOverride allowNoLineOverride">
+    <cs:lnRef idx="0"/>
+    <cs:fillRef idx="0"/>
+    <cs:effectRef idx="0"/>
+    <cs:fontRef idx="minor">
+      <a:schemeClr val="tx1"/>
+    </cs:fontRef>
+  </cs:plotArea3D>
+  <cs:seriesAxis>
+    <cs:lnRef idx="0"/>
+    <cs:fillRef idx="0"/>
+    <cs:effectRef idx="0"/>
+    <cs:fontRef idx="minor">
+      <a:schemeClr val="tx1">
+        <a:lumMod val="65000"/>
+        <a:lumOff val="35000"/>
+      </a:schemeClr>
+    </cs:fontRef>
+    <cs:defRPr sz="900" kern="1200"/>
+  </cs:seriesAxis>
+  <cs:seriesLine>
+    <cs:lnRef idx="0"/>
+    <cs:fillRef idx="0"/>
+    <cs:effectRef idx="0"/>
+    <cs:fontRef idx="minor">
+      <a:schemeClr val="tx1"/>
+    </cs:fontRef>
+    <cs:spPr>
+      <a:ln w="9525" cap="flat" cmpd="sng" algn="ctr">
+        <a:solidFill>
+          <a:schemeClr val="tx1">
+            <a:lumMod val="35000"/>
+            <a:lumOff val="65000"/>
+          </a:schemeClr>
+        </a:solidFill>
+        <a:round/>
+      </a:ln>
+    </cs:spPr>
+  </cs:seriesLine>
+  <cs:title>
+    <cs:lnRef idx="0"/>
+    <cs:fillRef idx="0"/>
+    <cs:effectRef idx="0"/>
+    <cs:fontRef idx="minor">
+      <a:schemeClr val="tx1">
+        <a:lumMod val="65000"/>
+        <a:lumOff val="35000"/>
+      </a:schemeClr>
+    </cs:fontRef>
+    <cs:defRPr sz="1400" b="0" kern="1200" spc="0" baseline="0"/>
+  </cs:title>
+  <cs:trendline>
+    <cs:lnRef idx="0">
+      <cs:styleClr val="auto"/>
+    </cs:lnRef>
+    <cs:fillRef idx="0"/>
+    <cs:effectRef idx="0"/>
+    <cs:fontRef idx="minor">
+      <a:schemeClr val="tx1"/>
+    </cs:fontRef>
+    <cs:spPr>
+      <a:ln w="19050" cap="rnd">
+        <a:solidFill>
+          <a:schemeClr val="phClr"/>
+        </a:solidFill>
+        <a:prstDash val="sysDot"/>
+      </a:ln>
+    </cs:spPr>
+  </cs:trendline>
+  <cs:trendlineLabel>
+    <cs:lnRef idx="0"/>
+    <cs:fillRef idx="0"/>
+    <cs:effectRef idx="0"/>
+    <cs:fontRef idx="minor">
+      <a:schemeClr val="tx1">
+        <a:lumMod val="65000"/>
+        <a:lumOff val="35000"/>
+      </a:schemeClr>
+    </cs:fontRef>
+    <cs:defRPr sz="900" kern="1200"/>
+  </cs:trendlineLabel>
+  <cs:upBar>
+    <cs:lnRef idx="0"/>
+    <cs:fillRef idx="0"/>
+    <cs:effectRef idx="0"/>
+    <cs:fontRef idx="minor">
+      <a:schemeClr val="dk1"/>
+    </cs:fontRef>
+    <cs:spPr>
+      <a:solidFill>
+        <a:schemeClr val="lt1"/>
+      </a:solidFill>
+      <a:ln w="9525">
+        <a:solidFill>
+          <a:schemeClr val="tx1">
+            <a:lumMod val="15000"/>
+            <a:lumOff val="85000"/>
+          </a:schemeClr>
+        </a:solidFill>
+      </a:ln>
+    </cs:spPr>
+  </cs:upBar>
+  <cs:valueAxis>
+    <cs:lnRef idx="0"/>
+    <cs:fillRef idx="0"/>
+    <cs:effectRef idx="0"/>
+    <cs:fontRef idx="minor">
+      <a:schemeClr val="tx1">
+        <a:lumMod val="65000"/>
+        <a:lumOff val="35000"/>
+      </a:schemeClr>
+    </cs:fontRef>
+    <cs:defRPr sz="900" kern="1200"/>
+  </cs:valueAxis>
+  <cs:wall>
+    <cs:lnRef idx="0"/>
+    <cs:fillRef idx="0"/>
+    <cs:effectRef idx="0"/>
+    <cs:fontRef idx="minor">
+      <a:schemeClr val="tx1"/>
+    </cs:fontRef>
+    <cs:spPr>
+      <a:noFill/>
+      <a:ln>
+        <a:noFill/>
+      </a:ln>
+    </cs:spPr>
+  </cs:wall>
+</cs:chartStyle>
+</file>
+
 <file path=word/theme/theme1.xml><?xml version="1.0" encoding="utf-8"?>
 <a:theme xmlns:a="http://schemas.openxmlformats.org/drawingml/2006/main" name="Office Theme">
   <a:themeElements>

</xml_diff>